<commit_message>
Fresh demo: app starts empty (shop setup only), sample files create everything on the spot
Co-Authored-By: Claude Sonnet 5.5 <noreply@anthropic.com>
Claude-Session: https://claude.ai/code/session_01AHZtQFX1ybNB4t9UAgVggR
</commit_message>
<xml_diff>
--- a/docs/DEMO_VIDEO_SCRIPT.docx
+++ b/docs/DEMO_VIDEO_SCRIPT.docx
@@ -84,7 +84,7 @@
           <w:sz w:val="22"/>
           <w:szCs w:val="22"/>
         </w:rPr>
-        <w:t xml:space="preserve">Log in as Owner (1234), open Settings, tap "Set semula demo", then log out. Do this before every take.</w:t>
+        <w:t xml:space="preserve">Log in as Owner (1234), open Settings, tap "Set semula demo", then log out. This wipes everything back to an empty app. Do this before every take.</w:t>
       </w:r>
     </w:p>
     <w:p>
@@ -101,7 +101,7 @@
           <w:sz w:val="22"/>
           <w:szCs w:val="22"/>
         </w:rPr>
-        <w:t xml:space="preserve">Use a phone-sized window, Bahasa Malaysia selected, notifications off.</w:t>
+        <w:t xml:space="preserve">The app opens empty on purpose: no orders, invoices or flags exist until you scan them. Only the 4 suppliers and their price history are loaded.</w:t>
       </w:r>
     </w:p>
     <w:p>
@@ -118,7 +118,7 @@
           <w:sz w:val="22"/>
           <w:szCs w:val="22"/>
         </w:rPr>
-        <w:t xml:space="preserve">If the 4-step intro appears after a login, tap "Langkau" to skip it.</w:t>
+        <w:t xml:space="preserve">Use a phone-sized window, Bahasa Malaysia selected, notifications off.</w:t>
       </w:r>
     </w:p>
     <w:p>
@@ -135,7 +135,7 @@
           <w:sz w:val="22"/>
           <w:szCs w:val="22"/>
         </w:rPr>
-        <w:t xml:space="preserve">Do not refresh the page while recording: the PIN screen returns on every reload.</w:t>
+        <w:t xml:space="preserve">If the 4-step intro appears after a login, tap "Langkau" to skip it.</w:t>
       </w:r>
     </w:p>
     <w:p>
@@ -152,7 +152,41 @@
           <w:sz w:val="22"/>
           <w:szCs w:val="22"/>
         </w:rPr>
+        <w:t xml:space="preserve">Do not refresh the page while recording: the PIN screen returns on every reload.</w:t>
+      </w:r>
+    </w:p>
+    <w:p>
+      <w:pPr>
+        <w:pStyle w:val="ListParagraph"/>
+        <w:numPr>
+          <w:ilvl w:val="0"/>
+          <w:numId w:val="2"/>
+        </w:numPr>
+        <w:spacing w:after="60"/>
+      </w:pPr>
+      <w:r>
+        <w:rPr>
+          <w:sz w:val="22"/>
+          <w:szCs w:val="22"/>
+        </w:rPr>
         <w:t xml:space="preserve">Uploading the same bon twice is blocked as a duplicate, so reset between takes.</w:t>
+      </w:r>
+    </w:p>
+    <w:p>
+      <w:pPr>
+        <w:pStyle w:val="ListParagraph"/>
+        <w:numPr>
+          <w:ilvl w:val="0"/>
+          <w:numId w:val="2"/>
+        </w:numPr>
+        <w:spacing w:after="60"/>
+      </w:pPr>
+      <w:r>
+        <w:rPr>
+          <w:sz w:val="22"/>
+          <w:szCs w:val="22"/>
+        </w:rPr>
+        <w:t xml:space="preserve">Scan the order (Pesanan) BEFORE the delivery bon. That is what lets the bon match the order.</w:t>
       </w:r>
     </w:p>
     <w:p>
@@ -316,7 +350,7 @@
                 <w:sz w:val="21"/>
                 <w:szCs w:val="21"/>
               </w:rPr>
-              <w:t xml:space="preserve">0:00–0:06</w:t>
+              <w:t xml:space="preserve">0:00–0:05</w:t>
             </w:r>
           </w:p>
         </w:tc>
@@ -378,7 +412,7 @@
                 <w:sz w:val="21"/>
                 <w:szCs w:val="21"/>
               </w:rPr>
-              <w:t xml:space="preserve">"Small shops pay for deliveries that came up short. Tepat Bill catches that before they pay."</w:t>
+              <w:t xml:space="preserve">"Small shops pay for deliveries that came up short. Tepat Bill catches it first."</w:t>
             </w:r>
           </w:p>
         </w:tc>
@@ -411,7 +445,7 @@
                 <w:sz w:val="21"/>
                 <w:szCs w:val="21"/>
               </w:rPr>
-              <w:t xml:space="preserve">MANAGER SIDE</w:t>
+              <w:t xml:space="preserve">MANAGER SIDE (the app starts empty)</w:t>
             </w:r>
           </w:p>
         </w:tc>
@@ -447,7 +481,7 @@
                 <w:sz w:val="21"/>
                 <w:szCs w:val="21"/>
               </w:rPr>
-              <w:t xml:space="preserve">0:06–0:12</w:t>
+              <w:t xml:space="preserve">0:05–0:09</w:t>
             </w:r>
           </w:p>
         </w:tc>
@@ -478,7 +512,7 @@
                 <w:sz w:val="21"/>
                 <w:szCs w:val="21"/>
               </w:rPr>
-              <w:t xml:space="preserve">Enter 5678. Hold 2 seconds on Home. Tap "Rekod penghantaran".</w:t>
+              <w:t xml:space="preserve">Enter 5678. Home is empty (RM0.00). Tap the Imbas button in the middle of the tab bar.</w:t>
             </w:r>
           </w:p>
         </w:tc>
@@ -509,7 +543,7 @@
                 <w:sz w:val="21"/>
                 <w:szCs w:val="21"/>
               </w:rPr>
-              <w:t xml:space="preserve">"A delivery arrives. I'm the manager."</w:t>
+              <w:t xml:space="preserve">"The shop starts empty. I scan the order first."</w:t>
             </w:r>
           </w:p>
         </w:tc>
@@ -545,7 +579,7 @@
                 <w:sz w:val="21"/>
                 <w:szCs w:val="21"/>
               </w:rPr>
-              <w:t xml:space="preserve">0:12–0:18</w:t>
+              <w:t xml:space="preserve">0:09–0:16</w:t>
             </w:r>
           </w:p>
         </w:tc>
@@ -576,7 +610,7 @@
                 <w:sz w:val="21"/>
                 <w:szCs w:val="21"/>
               </w:rPr>
-              <w:t xml:space="preserve">Tap "Cuba fail contoh", then "Bon bertandatangan (Maggi 8 sahaja)". Hold 2 seconds on "4 baris dibaca".</w:t>
+              <w:t xml:space="preserve">Tap "Cuba fail contoh", then under Pesanan pick "Nota pesanan tulisan tangan". Hold 1 second on "4 baris dibaca". Tap "Semak &amp; simpan", then "Simpan pesanan".</w:t>
             </w:r>
           </w:p>
         </w:tc>
@@ -607,7 +641,7 @@
                 <w:sz w:val="21"/>
                 <w:szCs w:val="21"/>
               </w:rPr>
-              <w:t xml:space="preserve">"I snap the signed bon. Gemini reads it."</w:t>
+              <w:t xml:space="preserve">"Gemini reads the handwritten order."</w:t>
             </w:r>
           </w:p>
         </w:tc>
@@ -643,7 +677,7 @@
                 <w:sz w:val="21"/>
                 <w:szCs w:val="21"/>
               </w:rPr>
-              <w:t xml:space="preserve">0:18–0:22</w:t>
+              <w:t xml:space="preserve">0:16–0:23</w:t>
             </w:r>
           </w:p>
         </w:tc>
@@ -674,7 +708,7 @@
                 <w:sz w:val="21"/>
                 <w:szCs w:val="21"/>
               </w:rPr>
-              <w:t xml:space="preserve">Tap "Semak &amp; simpan", then "Simpan &amp; kira barang".</w:t>
+              <w:t xml:space="preserve">Wait for the "PO-2610-001 disimpan" message to fade. Tap Imbas, then "Cuba fail contoh", then "Bon bertandatangan (Maggi 8 sahaja)" in the delivery list. Tap "Semak &amp; simpan". It shows "Sepadan dengan PO-2610-001". Tap "Simpan &amp; kira barang".</w:t>
             </w:r>
           </w:p>
         </w:tc>
@@ -705,7 +739,7 @@
                 <w:sz w:val="21"/>
                 <w:szCs w:val="21"/>
               </w:rPr>
-              <w:t xml:space="preserve">"I confirm the lines."</w:t>
+              <w:t xml:space="preserve">"Then the signed delivery bon. It matches the order."</w:t>
             </w:r>
           </w:p>
         </w:tc>
@@ -741,7 +775,7 @@
                 <w:sz w:val="21"/>
                 <w:szCs w:val="21"/>
               </w:rPr>
-              <w:t xml:space="preserve">0:22–0:33</w:t>
+              <w:t xml:space="preserve">0:23–0:34</w:t>
             </w:r>
           </w:p>
         </w:tc>
@@ -839,7 +873,7 @@
                 <w:sz w:val="21"/>
                 <w:szCs w:val="21"/>
               </w:rPr>
-              <w:t xml:space="preserve">0:33–0:35</w:t>
+              <w:t xml:space="preserve">0:34–0:36</w:t>
             </w:r>
           </w:p>
         </w:tc>
@@ -970,7 +1004,7 @@
                 <w:sz w:val="21"/>
                 <w:szCs w:val="21"/>
               </w:rPr>
-              <w:t xml:space="preserve">0:35–0:44</w:t>
+              <w:t xml:space="preserve">0:36–0:44</w:t>
             </w:r>
           </w:p>
         </w:tc>
@@ -1001,7 +1035,7 @@
                 <w:sz w:val="21"/>
                 <w:szCs w:val="21"/>
               </w:rPr>
-              <w:t xml:space="preserve">Tap Lagi, then Tetapan, then "Tukar pengguna". Enter 1234. Hold 1 second.</w:t>
+              <w:t xml:space="preserve">Tap Lagi, then Tetapan, then "Tukar pengguna". Enter 1234.</w:t>
             </w:r>
           </w:p>
         </w:tc>
@@ -1453,7 +1487,7 @@
           <w:sz w:val="22"/>
           <w:szCs w:val="22"/>
         </w:rPr>
-        <w:t xml:space="preserve">Pace: speak calmly, about 105 words in total. Tap once per action and keep the cursor still between taps. Speak over the pauses, not during the loading seconds.</w:t>
+        <w:t xml:space="preserve">Pace: speak calmly, about 110 words in total. A raw take of the manager side can run 10 to 15 seconds over: trim the waits and loading seconds in the edit rather than speaking faster. Tap once per action and keep the cursor still between taps. Speak over the pauses, not during the loading seconds.</w:t>
       </w:r>
     </w:p>
     <w:p>
@@ -1479,7 +1513,7 @@
           <w:sz w:val="22"/>
           <w:szCs w:val="22"/>
         </w:rPr>
-        <w:t xml:space="preserve">2 seconds on Home after the Manager login.</w:t>
+        <w:t xml:space="preserve">A 1-second hold after each AI read, so the viewer can see what Gemini found.</w:t>
       </w:r>
     </w:p>
     <w:p>
@@ -1633,7 +1667,7 @@
           <w:sz w:val="22"/>
           <w:szCs w:val="22"/>
         </w:rPr>
-        <w:t xml:space="preserve">Manager: scan a signed delivery bon, Gemini reads it, the manager types only what arrived, and the app calculates the shortage in exact RM.</w:t>
+        <w:t xml:space="preserve">Manager: scan the order and the signed delivery bon, Gemini reads them, the manager types only what arrived, and the app calculates the shortage in exact RM.</w:t>
       </w:r>
     </w:p>
     <w:p>

</xml_diff>